<commit_message>
feat: estructura oficial Informe Ejecutivo (I-VIII) + índice en PDFs/Word; re-extracción de 10 comisiones con objetivos estratégicos y articulación con Acuerdo Nacional/PEDN 2050 y Programas Presupuestales (Actividad 4 del TDR); ficha del dashboard reordenada al ToC oficial; doc V1606 de Desarrollo Humano e Industrialización
</commit_message>
<xml_diff>
--- a/entregables/acuicultura-y-pesca.docx
+++ b/entregables/acuicultura-y-pesca.docx
@@ -63,7 +63,7 @@
           <w:color w:val="1A2238"/>
           <w:sz w:val="23"/>
         </w:rPr>
-        <w:t>Documento de la Comisión Temática "Acuicultura y Pesca" del Plan Perú 2040 (CNPP / CIP). Diagnostica una acuicultura peruana mal orientada, retraída e incipiente comparada con la región, concentrada en pocas especies (concha de abanico, langostino, trucha, tilapia y peces amazónicos), sin plan de largo plazo integrado, con escasa investigación, débil interés de banca y empresa privada, dependencia de insumos importados (semilla y alimento), e injerencia política. Frente a ello, propone una visión al 2040 de una sociedad basada en la economía de la creatividad que aprovecha su biodiversidad, con la acuicultura como proveedora de proteína y oferta exportable con valor agregado. Articula 8 objetivos estratégicos, una base de desarrollo, factores clave de éxito, riesgos, involucrados y proyectos priorizados, todo condicionado a una previa Reforma del Estado y a la creación de un Instituto Nacional de Acuicultura.</w:t>
+        <w:t>Documento "Plan Perú 2040 - Acuicultura" del Colegio de Ingenieros del Perú (CIP). Plantea desarrollar la acuicultura como eje de seguridad alimentaria, generación de proteína accesible y oferta exportable con valor agregado, sustentado en reforma del Estado, CTI, marco legal e inversión privada. Nota: el documento NO sigue la estructura estándar del "Informe Ejecutivo" (no incluye Matriz Resumen cuantitativa, Hitos de 100 días ni listas explícitas de articulación al PEDN/Programas Presupuestales).</w:t>
       </w:r>
     </w:p>
     <w:p>
@@ -108,7 +108,7 @@
                 <w:color w:val="D91023"/>
                 <w:sz w:val="36"/>
               </w:rPr>
-              <w:t>8</w:t>
+              <w:t>4</w:t>
               <w:br/>
             </w:r>
             <w:r>
@@ -140,7 +140,7 @@
                 <w:color w:val="D91023"/>
                 <w:sz w:val="36"/>
               </w:rPr>
-              <w:t>8</w:t>
+              <w:t>5</w:t>
               <w:br/>
             </w:r>
             <w:r>
@@ -172,7 +172,7 @@
                 <w:color w:val="D91023"/>
                 <w:sz w:val="36"/>
               </w:rPr>
-              <w:t>11</w:t>
+              <w:t>8</w:t>
               <w:br/>
             </w:r>
             <w:r>
@@ -183,7 +183,7 @@
                 <w:color w:val="5D6B88"/>
                 <w:sz w:val="17"/>
               </w:rPr>
-              <w:t>Metas 2050</w:t>
+              <w:t>Objetivos</w:t>
             </w:r>
           </w:p>
         </w:tc>
@@ -230,7 +230,151 @@
           <w:color w:val="D91023"/>
           <w:sz w:val="26"/>
         </w:rPr>
-        <w:t>Visión 2050</w:t>
+        <w:t>Contenido</w:t>
+      </w:r>
+    </w:p>
+    <w:p>
+      <w:r>
+        <w:rPr>
+          <w:rFonts w:ascii="Calibri" w:hAnsi="Calibri"/>
+          <w:b/>
+          <w:i w:val="0"/>
+          <w:color w:val="D91023"/>
+          <w:sz w:val="20"/>
+        </w:rPr>
+        <w:t xml:space="preserve">I.  </w:t>
+      </w:r>
+      <w:r>
+        <w:rPr>
+          <w:rFonts w:ascii="Calibri" w:hAnsi="Calibri"/>
+          <w:b w:val="0"/>
+          <w:i w:val="0"/>
+          <w:color w:val="1A2238"/>
+          <w:sz w:val="20"/>
+        </w:rPr>
+        <w:t>Síntesis de la situación futura</w:t>
+      </w:r>
+    </w:p>
+    <w:p>
+      <w:r>
+        <w:rPr>
+          <w:rFonts w:ascii="Calibri" w:hAnsi="Calibri"/>
+          <w:b/>
+          <w:i w:val="0"/>
+          <w:color w:val="D91023"/>
+          <w:sz w:val="20"/>
+        </w:rPr>
+        <w:t xml:space="preserve">II.  </w:t>
+      </w:r>
+      <w:r>
+        <w:rPr>
+          <w:rFonts w:ascii="Calibri" w:hAnsi="Calibri"/>
+          <w:b w:val="0"/>
+          <w:i w:val="0"/>
+          <w:color w:val="1A2238"/>
+          <w:sz w:val="20"/>
+        </w:rPr>
+        <w:t>Síntesis de la situación actual</w:t>
+      </w:r>
+    </w:p>
+    <w:p>
+      <w:r>
+        <w:rPr>
+          <w:rFonts w:ascii="Calibri" w:hAnsi="Calibri"/>
+          <w:b/>
+          <w:i w:val="0"/>
+          <w:color w:val="D91023"/>
+          <w:sz w:val="20"/>
+        </w:rPr>
+        <w:t xml:space="preserve">III.  </w:t>
+      </w:r>
+      <w:r>
+        <w:rPr>
+          <w:rFonts w:ascii="Calibri" w:hAnsi="Calibri"/>
+          <w:b w:val="0"/>
+          <w:i w:val="0"/>
+          <w:color w:val="1A2238"/>
+          <w:sz w:val="20"/>
+        </w:rPr>
+        <w:t>Objetivos estratégicos</w:t>
+      </w:r>
+    </w:p>
+    <w:p>
+      <w:r>
+        <w:rPr>
+          <w:rFonts w:ascii="Calibri" w:hAnsi="Calibri"/>
+          <w:b/>
+          <w:i w:val="0"/>
+          <w:color w:val="D91023"/>
+          <w:sz w:val="20"/>
+        </w:rPr>
+        <w:t xml:space="preserve">IV.  </w:t>
+      </w:r>
+      <w:r>
+        <w:rPr>
+          <w:rFonts w:ascii="Calibri" w:hAnsi="Calibri"/>
+          <w:b w:val="0"/>
+          <w:i w:val="0"/>
+          <w:color w:val="1A2238"/>
+          <w:sz w:val="20"/>
+        </w:rPr>
+        <w:t>Acciones estratégicas</w:t>
+      </w:r>
+    </w:p>
+    <w:p>
+      <w:r>
+        <w:rPr>
+          <w:rFonts w:ascii="Calibri" w:hAnsi="Calibri"/>
+          <w:b/>
+          <w:i w:val="0"/>
+          <w:color w:val="D91023"/>
+          <w:sz w:val="20"/>
+        </w:rPr>
+        <w:t xml:space="preserve">V.  </w:t>
+      </w:r>
+      <w:r>
+        <w:rPr>
+          <w:rFonts w:ascii="Calibri" w:hAnsi="Calibri"/>
+          <w:b w:val="0"/>
+          <w:i w:val="0"/>
+          <w:color w:val="1A2238"/>
+          <w:sz w:val="20"/>
+        </w:rPr>
+        <w:t>Matriz resumen (indicadores)</w:t>
+      </w:r>
+    </w:p>
+    <w:p>
+      <w:r>
+        <w:rPr>
+          <w:rFonts w:ascii="Calibri" w:hAnsi="Calibri"/>
+          <w:b/>
+          <w:i w:val="0"/>
+          <w:color w:val="D91023"/>
+          <w:sz w:val="20"/>
+        </w:rPr>
+        <w:t xml:space="preserve">VII.  </w:t>
+      </w:r>
+      <w:r>
+        <w:rPr>
+          <w:rFonts w:ascii="Calibri" w:hAnsi="Calibri"/>
+          <w:b w:val="0"/>
+          <w:i w:val="0"/>
+          <w:color w:val="1A2238"/>
+          <w:sz w:val="20"/>
+        </w:rPr>
+        <w:t>Articulación con el Acuerdo Nacional y el PEDN al 2050</w:t>
+      </w:r>
+    </w:p>
+    <w:p>
+      <w:r>
+        <w:rPr>
+          <w:rFonts w:ascii="Calibri" w:hAnsi="Calibri"/>
+          <w:b/>
+          <w:i w:val="0"/>
+          <w:color w:val="D91023"/>
+          <w:sz w:val="26"/>
+        </w:rPr>
+        <w:t>I · Síntesis de la situación futura</w:t>
       </w:r>
     </w:p>
     <w:p>
@@ -242,7 +386,7 @@
           <w:color w:val="1A2238"/>
           <w:sz w:val="21"/>
         </w:rPr>
-        <w:t>En el año 2040 el Perú será una sociedad con responsabilidad social educada en la economía de la creatividad, aprovechando su biodiversidad —convertida en su eje económico— e innovando a través de la ciencia, la tecnología e innovación con productos y servicios de alta calidad. Será líder en la oferta exportable de productos con valor agregado, con una población con alta calidad de vida, oportunidades para su desarrollo, en un ambiente sostenible y teniendo su biodiversidad como marca País. Para la acuicultura, la visión es promover la generación de recursos materiales, tecnológicos y financieros pertinentes, así como los servicios técnicos y condiciones institucionales adecuadas para facilitar la inversión privada en la producción acuícola y la comercialización de productos acuícolas en el mercado nacional e internacional.</w:t>
+        <w:t>Al año 2040 el Perú será una sociedad con responsabilidad social, educada en la economía de la creatividad, que aprovecha su biodiversidad convertida en su eje económico, innovando a través de la ciencia, la tecnología e innovación con productos y servicios de alta calidad. Será líder en la oferta exportable de productos con valor agregado, donde la población tiene una alta calidad de vida, con oportunidades para su desarrollo, en un ambiente sostenible y teniendo a su biodiversidad como marca País en el mundo. Visión de la acuicultura: promover la generación de recursos materiales, tecnológicos y financieros pertinentes, así como los servicios técnicos y condiciones institucionales adecuadas para facilitar la inversión privada en la producción acuícola y comercialización de productos acuícolas en el mercado nacional e internacional.</w:t>
       </w:r>
     </w:p>
     <w:p>
@@ -254,7 +398,7 @@
           <w:color w:val="D91023"/>
           <w:sz w:val="26"/>
         </w:rPr>
-        <w:t>Diagnóstico — brecha 2026</w:t>
+        <w:t>II · Síntesis de la situación actual</w:t>
       </w:r>
     </w:p>
     <w:p>
@@ -269,7 +413,7 @@
           <w:color w:val="1A2238"/>
           <w:sz w:val="21"/>
         </w:rPr>
-        <w:t>La acuicultura en el Perú se encuentra mal orientada, retraída y aletargada respecto del mundo actual; su desarrollo es incipiente comparado con otros países de la región y orientada al cultivo de pocas especies.</w:t>
+        <w:t>La acuicultura en el Perú está mal orientada, retraída y aletargada respecto del mundo actual; su desarrollo es incipiente comparado con otros países de la región y está orientada al cultivo de pocas especies.</w:t>
       </w:r>
     </w:p>
     <w:p>
@@ -284,7 +428,7 @@
           <w:color w:val="1A2238"/>
           <w:sz w:val="21"/>
         </w:rPr>
-        <w:t>Distribución del área otorgada: 76.41% (15,843.53 ha) corresponde a la actividad acuícola marina y 23.59% (4,891.93 ha) a la actividad acuícola continental.</w:t>
+        <w:t>El 76.41% del área otorgada (15,843.53) corresponde a la actividad acuícola marina y el 23.59% (4,891.93) a la actividad acuícola continental.</w:t>
       </w:r>
     </w:p>
     <w:p>
@@ -299,7 +443,7 @@
           <w:color w:val="1A2238"/>
           <w:sz w:val="21"/>
         </w:rPr>
-        <w:t>Cultivos más extendidos (concha de abanico y langostino) destinados principalmente a exportación; trucha en zonas altoandinas para mercado local y exportación; peces nativos (gamitana, paco, boquichico) para mercado local; tilapia en selva alta (San Martín) y costa norte.</w:t>
+        <w:t>Los cultivos más extendidos son concha de abanico y langostino (orientados principalmente a la exportación) y trucha en zonas altoandinas (mercado local y exportación); otras especies son peces nativos amazónicos (Gamitana, Paco, Boquichico) y tilapia (San Martín y costa norte).</w:t>
       </w:r>
     </w:p>
     <w:p>
@@ -329,7 +473,7 @@
           <w:color w:val="1A2238"/>
           <w:sz w:val="21"/>
         </w:rPr>
-        <w:t>Estudios e investigaciones sobre la acuicultura peruana y la evolución de sus mercados interno y externo son escasos, lo que limita ubicar especies con ventajas competitivas; por ello la empresa privada y la banca comercial muestran pobre interés en invertir o dar créditos.</w:t>
+        <w:t>Los estudios e investigaciones sobre acuicultura peruana y la evolución de mercados interno y externo son escasos, lo que limita identificar especies con ventajas competitivas y estimar el crecimiento del sector.</w:t>
       </w:r>
     </w:p>
     <w:p>
@@ -344,7 +488,7 @@
           <w:color w:val="1A2238"/>
           <w:sz w:val="21"/>
         </w:rPr>
-        <w:t>Falta efectiva integración entre pequeñas y medianas empresas, lo que impide la estandarización de la producción y un mercadeo eficaz.</w:t>
+        <w:t>La empresa privada y la banca comercial muestran pobre interés en invertir o facilitar créditos.</w:t>
       </w:r>
     </w:p>
     <w:p>
@@ -359,7 +503,7 @@
           <w:color w:val="1A2238"/>
           <w:sz w:val="21"/>
         </w:rPr>
-        <w:t>El Perú sigue siendo un país pesquero extractivo tradicional para consumo humano indirecto (harina de pescado); su crecimiento desmesurado pone en riesgo el ecosistema y deja pasivos ambientales muy negativos que pasan desapercibidos.</w:t>
+        <w:t>El Perú es un país pesquero extractivo tradicional para consumo humano indirecto (harina de pescado); su desmesurado crecimiento pone en riesgo el ecosistema y deja pasivos ambientales muy negativos.</w:t>
       </w:r>
     </w:p>
     <w:p>
@@ -374,7 +518,7 @@
           <w:color w:val="1A2238"/>
           <w:sz w:val="21"/>
         </w:rPr>
-        <w:t>Recursos hídricos abundantes para uso acuícola en serio riesgo de extinción por pasivos ambientales de otras actividades (minería, pesca, actividad urbana caótica).</w:t>
+        <w:t>Recursos hídricos abundantes para uso acuícola, pero en riesgo de extinción por pasivos ambientales de otras actividades (minería, pesca, actividad urbana caótica).</w:t>
       </w:r>
     </w:p>
     <w:p>
@@ -389,7 +533,7 @@
           <w:color w:val="1A2238"/>
           <w:sz w:val="21"/>
         </w:rPr>
-        <w:t>Gran porcentaje de la población en pobreza y pobreza extrema, con carencias proteicas gigantescas que una acuicultura desarrollada podría reducir drásticamente.</w:t>
+        <w:t>Gran porcentaje de la población en pobreza y pobreza extrema, con carencias proteicas gigantescas que podrían reducirse drásticamente con voluntad política para impulsar la acuicultura.</w:t>
       </w:r>
     </w:p>
     <w:p>
@@ -404,7 +548,7 @@
           <w:color w:val="1A2238"/>
           <w:sz w:val="21"/>
         </w:rPr>
-        <w:t>Dependencia de insumos importados: semilla de langostino a partir de nauplios importados de Ecuador y postlarvas; ovas embrionadas de trucha importadas de Norteamérica o Europa; alimento (piensos) es el insumo más costoso, concentrado en dos empresas nacionales líderes.</w:t>
+        <w:t>Insumos críticos: la semilla (langostino con nauplios/postlarvas importados de Ecuador; trucha con ovas embrionadas importadas de Norteamérica o Europa; concha de abanico de bancos naturales) y el alimento balanceado (en pequeña escala suele ser de calidad muy pobre y se desconoce su costo).</w:t>
       </w:r>
     </w:p>
     <w:p>
@@ -419,7 +563,7 @@
           <w:color w:val="1A2238"/>
           <w:sz w:val="21"/>
         </w:rPr>
-        <w:t>En granjas de pequeña escala y subsistencia (tilapia y peces amazónicos), el alimento es de calidad muy pobre y los productores desconocen el costo del alimento dentro del costo de producción.</w:t>
+        <w:t>Limitado número de especialistas de nivel superior en genética, nutrición y manejo de enfermedades, y escasez de escuelas técnicas para formación práctica de acuicultores.</w:t>
       </w:r>
     </w:p>
     <w:p>
@@ -434,7 +578,7 @@
           <w:color w:val="1A2238"/>
           <w:sz w:val="21"/>
         </w:rPr>
-        <w:t>Limitado número de especialistas de nivel superior en genética, nutrición y manejo de enfermedades, y de escuelas técnicas para formación práctica de acuicultores.</w:t>
+        <w:t>Dificultades de equipos, transporte, energía y comunicaciones para los cultivos de trucha, tilapia y peces amazónicos, a diferencia de langostino y concha de abanico que cuentan con infraestructura adecuada.</w:t>
       </w:r>
     </w:p>
     <w:p>
@@ -449,7 +593,19 @@
           <w:color w:val="1A2238"/>
           <w:sz w:val="21"/>
         </w:rPr>
-        <w:t>Dificultades de equipos, materiales, transporte, energía y comunicaciones para los cultivos de trucha, tilapia y peces amazónicos (a diferencia de la industria langostinera y de concha de abanico).</w:t>
+        <w:t>Riesgos identificados: falta de planificación de largo plazo; fenómenos naturales y epizootias no previsibles; alteración de precios de insumos; monopolio de insumos; injerencia política partidaria en cargos técnicos; disminución de niveles de competencia y probidad del capital humano; y la corrupción.</w:t>
+      </w:r>
+    </w:p>
+    <w:p>
+      <w:r>
+        <w:rPr>
+          <w:rFonts w:ascii="Calibri" w:hAnsi="Calibri"/>
+          <w:b/>
+          <w:i w:val="0"/>
+          <w:color w:val="D91023"/>
+          <w:sz w:val="26"/>
+        </w:rPr>
+        <w:t>III · Objetivos estratégicos</w:t>
       </w:r>
     </w:p>
     <w:p>
@@ -464,7 +620,112 @@
           <w:color w:val="1A2238"/>
           <w:sz w:val="21"/>
         </w:rPr>
-        <w:t>Riesgos identificados: falta de planificación de largo plazo; fenómenos naturales que alteren el régimen climático o causen desastres; epizootias no previsibles; alteración de precios de insumos; monopolio de insumos; injerencia política partidaria en cargos técnicos; disminución de la competencia y probidad del capital humano; y la corrupción.</w:t>
+        <w:t>Objetivo N° 1: Incrementar la calidad, productividad y el volumen de producción acuícola comercializado a nivel nacional e internacional.</w:t>
+      </w:r>
+    </w:p>
+    <w:p>
+      <w:pPr>
+        <w:pStyle w:val="ListBullet"/>
+      </w:pPr>
+      <w:r>
+        <w:rPr>
+          <w:rFonts w:ascii="Calibri" w:hAnsi="Calibri"/>
+          <w:b w:val="0"/>
+          <w:i w:val="0"/>
+          <w:color w:val="1A2238"/>
+          <w:sz w:val="21"/>
+        </w:rPr>
+        <w:t>Objetivo N° 2: Incrementar la inversión privada en acuicultura.</w:t>
+      </w:r>
+    </w:p>
+    <w:p>
+      <w:pPr>
+        <w:pStyle w:val="ListBullet"/>
+      </w:pPr>
+      <w:r>
+        <w:rPr>
+          <w:rFonts w:ascii="Calibri" w:hAnsi="Calibri"/>
+          <w:b w:val="0"/>
+          <w:i w:val="0"/>
+          <w:color w:val="1A2238"/>
+          <w:sz w:val="21"/>
+        </w:rPr>
+        <w:t>Objetivo N° 3: Promover la producción nacional de insumos (semillas y alimento balanceado) para la acuicultura.</w:t>
+      </w:r>
+    </w:p>
+    <w:p>
+      <w:pPr>
+        <w:pStyle w:val="ListBullet"/>
+      </w:pPr>
+      <w:r>
+        <w:rPr>
+          <w:rFonts w:ascii="Calibri" w:hAnsi="Calibri"/>
+          <w:b w:val="0"/>
+          <w:i w:val="0"/>
+          <w:color w:val="1A2238"/>
+          <w:sz w:val="21"/>
+        </w:rPr>
+        <w:t>Objetivo N° 4: Promover el desarrollo de servicios de formación, capacitación y asistencia técnica para la producción y comercialización acuícola.</w:t>
+      </w:r>
+    </w:p>
+    <w:p>
+      <w:pPr>
+        <w:pStyle w:val="ListBullet"/>
+      </w:pPr>
+      <w:r>
+        <w:rPr>
+          <w:rFonts w:ascii="Calibri" w:hAnsi="Calibri"/>
+          <w:b w:val="0"/>
+          <w:i w:val="0"/>
+          <w:color w:val="1A2238"/>
+          <w:sz w:val="21"/>
+        </w:rPr>
+        <w:t>Objetivo N° 5: Promover el desarrollo de servicios de control sanitario para la producción y comercialización acuícola.</w:t>
+      </w:r>
+    </w:p>
+    <w:p>
+      <w:pPr>
+        <w:pStyle w:val="ListBullet"/>
+      </w:pPr>
+      <w:r>
+        <w:rPr>
+          <w:rFonts w:ascii="Calibri" w:hAnsi="Calibri"/>
+          <w:b w:val="0"/>
+          <w:i w:val="0"/>
+          <w:color w:val="1A2238"/>
+          <w:sz w:val="21"/>
+        </w:rPr>
+        <w:t>Objetivo N° 6: Promover la investigación y desarrollo, la adaptación y transferencia tecnológica en materia acuícola.</w:t>
+      </w:r>
+    </w:p>
+    <w:p>
+      <w:pPr>
+        <w:pStyle w:val="ListBullet"/>
+      </w:pPr>
+      <w:r>
+        <w:rPr>
+          <w:rFonts w:ascii="Calibri" w:hAnsi="Calibri"/>
+          <w:b w:val="0"/>
+          <w:i w:val="0"/>
+          <w:color w:val="1A2238"/>
+          <w:sz w:val="21"/>
+        </w:rPr>
+        <w:t>Objetivo N° 7: Contar con una estructura organizacional y capacidades humanas adecuadas para una efectiva elaboración, implementación y evaluación de las políticas e instrumentos de política de promoción acuícola.</w:t>
+      </w:r>
+    </w:p>
+    <w:p>
+      <w:pPr>
+        <w:pStyle w:val="ListBullet"/>
+      </w:pPr>
+      <w:r>
+        <w:rPr>
+          <w:rFonts w:ascii="Calibri" w:hAnsi="Calibri"/>
+          <w:b w:val="0"/>
+          <w:i w:val="0"/>
+          <w:color w:val="1A2238"/>
+          <w:sz w:val="21"/>
+        </w:rPr>
+        <w:t>Objetivo N° 8: Obtener y usar óptimamente recursos financieros para la promoción de la acuicultura, analizando, diseñando e implementando instrumentos para su incremento, distribución y óptimo uso.</w:t>
       </w:r>
     </w:p>
     <w:p>
@@ -476,7 +737,304 @@
           <w:color w:val="D91023"/>
           <w:sz w:val="26"/>
         </w:rPr>
-        <w:t>Indicadores: hoy → meta 2050</w:t>
+        <w:t>IV · Acciones estratégicas</w:t>
+      </w:r>
+    </w:p>
+    <w:p>
+      <w:pPr>
+        <w:pStyle w:val="ListBullet"/>
+      </w:pPr>
+      <w:r>
+        <w:rPr>
+          <w:rFonts w:ascii="Calibri" w:hAnsi="Calibri"/>
+          <w:b w:val="0"/>
+          <w:i w:val="0"/>
+          <w:color w:val="1A2238"/>
+          <w:sz w:val="21"/>
+        </w:rPr>
+        <w:t>Apoyar el desarrollo de capacidades exportadoras de las empresas productoras acuícolas orgánicas (información comercial y asesoría) y propiciar la asociatividad para facilitar el acceso al mercado de exportación.</w:t>
+      </w:r>
+    </w:p>
+    <w:p>
+      <w:pPr>
+        <w:pStyle w:val="ListBullet"/>
+      </w:pPr>
+      <w:r>
+        <w:rPr>
+          <w:rFonts w:ascii="Calibri" w:hAnsi="Calibri"/>
+          <w:b w:val="0"/>
+          <w:i w:val="0"/>
+          <w:color w:val="1A2238"/>
+          <w:sz w:val="21"/>
+        </w:rPr>
+        <w:t>Propiciar el posicionamiento y fortalecimiento de productos acuícolas en mercados internacionales mediante promoción comercial de PROMPERU, con apoyo del Ministerio de Comercio Exterior y Turismo.</w:t>
+      </w:r>
+    </w:p>
+    <w:p>
+      <w:pPr>
+        <w:pStyle w:val="ListBullet"/>
+      </w:pPr>
+      <w:r>
+        <w:rPr>
+          <w:rFonts w:ascii="Calibri" w:hAnsi="Calibri"/>
+          <w:b w:val="0"/>
+          <w:i w:val="0"/>
+          <w:color w:val="1A2238"/>
+          <w:sz w:val="21"/>
+        </w:rPr>
+        <w:t>Desarrollar el mercado interno para productos de la acuicultura: conocer el mercado, capacitar personal en manipulación de productos pesqueros y desarrollar infraestructura de mercadeo.</w:t>
+      </w:r>
+    </w:p>
+    <w:p>
+      <w:pPr>
+        <w:pStyle w:val="ListBullet"/>
+      </w:pPr>
+      <w:r>
+        <w:rPr>
+          <w:rFonts w:ascii="Calibri" w:hAnsi="Calibri"/>
+          <w:b w:val="0"/>
+          <w:i w:val="0"/>
+          <w:color w:val="1A2238"/>
+          <w:sz w:val="21"/>
+        </w:rPr>
+        <w:t>Fortalecer los mecanismos de aseguramiento y control de la calidad, capacitando a SANIPES y a capacitadores en inocuidad y control de calidad usando el manual respectivo.</w:t>
+      </w:r>
+    </w:p>
+    <w:p>
+      <w:pPr>
+        <w:pStyle w:val="ListBullet"/>
+      </w:pPr>
+      <w:r>
+        <w:rPr>
+          <w:rFonts w:ascii="Calibri" w:hAnsi="Calibri"/>
+          <w:b w:val="0"/>
+          <w:i w:val="0"/>
+          <w:color w:val="1A2238"/>
+          <w:sz w:val="21"/>
+        </w:rPr>
+        <w:t>Promover el diseño de normas técnicas para la acuicultura orientadas al posicionamiento en nuevos mercados.</w:t>
+      </w:r>
+    </w:p>
+    <w:p>
+      <w:pPr>
+        <w:pStyle w:val="ListBullet"/>
+      </w:pPr>
+      <w:r>
+        <w:rPr>
+          <w:rFonts w:ascii="Calibri" w:hAnsi="Calibri"/>
+          <w:b w:val="0"/>
+          <w:i w:val="0"/>
+          <w:color w:val="1A2238"/>
+          <w:sz w:val="21"/>
+        </w:rPr>
+        <w:t>Fomentar la viabilidad económica y competitividad de las granjas acuícolas, fortaleciendo la capacidad de gestión y formalidad de productores de menor escala y subsistencia mediante capacitación y asistencia técnica.</w:t>
+      </w:r>
+    </w:p>
+    <w:p>
+      <w:pPr>
+        <w:pStyle w:val="ListBullet"/>
+      </w:pPr>
+      <w:r>
+        <w:rPr>
+          <w:rFonts w:ascii="Calibri" w:hAnsi="Calibri"/>
+          <w:b w:val="0"/>
+          <w:i w:val="0"/>
+          <w:color w:val="1A2238"/>
+          <w:sz w:val="21"/>
+        </w:rPr>
+        <w:t>Fomentar la organización y gestión empresarial de pequeños y medianos acuicultores (gremios, asociaciones) e incrementar capacidades para gestionar granjas como unidades económicas.</w:t>
+      </w:r>
+    </w:p>
+    <w:p>
+      <w:pPr>
+        <w:pStyle w:val="ListBullet"/>
+      </w:pPr>
+      <w:r>
+        <w:rPr>
+          <w:rFonts w:ascii="Calibri" w:hAnsi="Calibri"/>
+          <w:b w:val="0"/>
+          <w:i w:val="0"/>
+          <w:color w:val="1A2238"/>
+          <w:sz w:val="21"/>
+        </w:rPr>
+        <w:t>Contar con un Sistema de Información Geográfica de acuicultura actualizado, descentralizado e interconectado, publicando datos en el Catastro Acuícola Nacional e interconectándolo con las Regiones mediante software adecuado.</w:t>
+      </w:r>
+    </w:p>
+    <w:p>
+      <w:pPr>
+        <w:pStyle w:val="ListBullet"/>
+      </w:pPr>
+      <w:r>
+        <w:rPr>
+          <w:rFonts w:ascii="Calibri" w:hAnsi="Calibri"/>
+          <w:b w:val="0"/>
+          <w:i w:val="0"/>
+          <w:color w:val="1A2238"/>
+          <w:sz w:val="21"/>
+        </w:rPr>
+        <w:t>Promover la mejora de infraestructura de comunicaciones y servicios (vías de acceso, cadenas de frío, energía) en zonas de desarrollo acuícola, gestionando ante Gobiernos Regionales, APP y empresas.</w:t>
+      </w:r>
+    </w:p>
+    <w:p>
+      <w:pPr>
+        <w:pStyle w:val="ListBullet"/>
+      </w:pPr>
+      <w:r>
+        <w:rPr>
+          <w:rFonts w:ascii="Calibri" w:hAnsi="Calibri"/>
+          <w:b w:val="0"/>
+          <w:i w:val="0"/>
+          <w:color w:val="1A2238"/>
+          <w:sz w:val="21"/>
+        </w:rPr>
+        <w:t>Promover la simplificación de trámites para el otorgamiento de derechos, optimizando la Ventanilla Única de Acuicultura (VUA), y fortalecer la estabilidad jurídica y derechos de uso de áreas acuáticas.</w:t>
+      </w:r>
+    </w:p>
+    <w:p>
+      <w:pPr>
+        <w:pStyle w:val="ListBullet"/>
+      </w:pPr>
+      <w:r>
+        <w:rPr>
+          <w:rFonts w:ascii="Calibri" w:hAnsi="Calibri"/>
+          <w:b w:val="0"/>
+          <w:i w:val="0"/>
+          <w:color w:val="1A2238"/>
+          <w:sz w:val="21"/>
+        </w:rPr>
+        <w:t>Promover el ordenamiento territorial que favorezca el desarrollo y expansión de la acuicultura evitando conflictos por uso de áreas acuáticas.</w:t>
+      </w:r>
+    </w:p>
+    <w:p>
+      <w:pPr>
+        <w:pStyle w:val="ListBullet"/>
+      </w:pPr>
+      <w:r>
+        <w:rPr>
+          <w:rFonts w:ascii="Calibri" w:hAnsi="Calibri"/>
+          <w:b w:val="0"/>
+          <w:i w:val="0"/>
+          <w:color w:val="1A2238"/>
+          <w:sz w:val="21"/>
+        </w:rPr>
+        <w:t>Promover la mejora de los centros de producción acuícola estatales (vía gobiernos regionales, sector privado o APP) para abastecer semilla de buena calidad.</w:t>
+      </w:r>
+    </w:p>
+    <w:p>
+      <w:pPr>
+        <w:pStyle w:val="ListBullet"/>
+      </w:pPr>
+      <w:r>
+        <w:rPr>
+          <w:rFonts w:ascii="Calibri" w:hAnsi="Calibri"/>
+          <w:b w:val="0"/>
+          <w:i w:val="0"/>
+          <w:color w:val="1A2238"/>
+          <w:sz w:val="21"/>
+        </w:rPr>
+        <w:t>Promover la producción de alimento de buena calidad, fomentar normas técnicas de alimento balanceado (harina de pescado u otros sustitutos de bajo costo) e instalar plantas piloto de alimento balanceado.</w:t>
+      </w:r>
+    </w:p>
+    <w:p>
+      <w:pPr>
+        <w:pStyle w:val="ListBullet"/>
+      </w:pPr>
+      <w:r>
+        <w:rPr>
+          <w:rFonts w:ascii="Calibri" w:hAnsi="Calibri"/>
+          <w:b w:val="0"/>
+          <w:i w:val="0"/>
+          <w:color w:val="1A2238"/>
+          <w:sz w:val="21"/>
+        </w:rPr>
+        <w:t>Mejorar la capacitación de personal mediante programas de capacitación/extensión en las Regiones, implementar protocolos de buenas prácticas acuícolas mediante granjas demostrativas y mejorar la formación universitaria y de postgrado.</w:t>
+      </w:r>
+    </w:p>
+    <w:p>
+      <w:pPr>
+        <w:pStyle w:val="ListBullet"/>
+      </w:pPr>
+      <w:r>
+        <w:rPr>
+          <w:rFonts w:ascii="Calibri" w:hAnsi="Calibri"/>
+          <w:b w:val="0"/>
+          <w:i w:val="0"/>
+          <w:color w:val="1A2238"/>
+          <w:sz w:val="21"/>
+        </w:rPr>
+        <w:t>Prevenir y controlar enfermedades estableciendo un sistema nacional de sanidad acuícola con centros de referencia equipados, y regular la prestación de servicios de sanidad acuícola.</w:t>
+      </w:r>
+    </w:p>
+    <w:p>
+      <w:pPr>
+        <w:pStyle w:val="ListBullet"/>
+      </w:pPr>
+      <w:r>
+        <w:rPr>
+          <w:rFonts w:ascii="Calibri" w:hAnsi="Calibri"/>
+          <w:b w:val="0"/>
+          <w:i w:val="0"/>
+          <w:color w:val="1A2238"/>
+          <w:sz w:val="21"/>
+        </w:rPr>
+        <w:t>Establecer prioridades de investigación sobre especies marinas y continentales (exóticas con tecnologías conocidas y nativas), desarrollar y adaptar tecnologías para producir semilla de alta calidad en el país, mediante asociación entre instituciones de investigación y empresas.</w:t>
+      </w:r>
+    </w:p>
+    <w:p>
+      <w:pPr>
+        <w:pStyle w:val="ListBullet"/>
+      </w:pPr>
+      <w:r>
+        <w:rPr>
+          <w:rFonts w:ascii="Calibri" w:hAnsi="Calibri"/>
+          <w:b w:val="0"/>
+          <w:i w:val="0"/>
+          <w:color w:val="1A2238"/>
+          <w:sz w:val="21"/>
+        </w:rPr>
+        <w:t>Fortalecer capacidades organizacionales y de recursos humanos para la ordenación, fomento y desarrollo de la acuicultura, y optimizar el sistema de captación y difusión de información estadística regional y nacional.</w:t>
+      </w:r>
+    </w:p>
+    <w:p>
+      <w:pPr>
+        <w:pStyle w:val="ListBullet"/>
+      </w:pPr>
+      <w:r>
+        <w:rPr>
+          <w:rFonts w:ascii="Calibri" w:hAnsi="Calibri"/>
+          <w:b w:val="0"/>
+          <w:i w:val="0"/>
+          <w:color w:val="1A2238"/>
+          <w:sz w:val="21"/>
+        </w:rPr>
+        <w:t>Obtener, distribuir y usar óptimamente recursos financieros para la promoción de la acuicultura mediante instrumentos diseñados para ese fin.</w:t>
+      </w:r>
+    </w:p>
+    <w:p>
+      <w:pPr>
+        <w:pStyle w:val="ListBullet"/>
+      </w:pPr>
+      <w:r>
+        <w:rPr>
+          <w:rFonts w:ascii="Calibri" w:hAnsi="Calibri"/>
+          <w:b w:val="0"/>
+          <w:i w:val="0"/>
+          <w:color w:val="1A2238"/>
+          <w:sz w:val="21"/>
+        </w:rPr>
+        <w:t>Proyectos priorizados: simplificación administrativa de autorizaciones y concesiones; reducción sistemática de la corrupción; aseguramiento de insumos (semilla y alimento básico inicial); creación del Instituto Nacional de Acuicultura; perfeccionamiento del sistema de planificación; participación del Estado y reforma del sistema; y apoyo institucional al desarrollo de la actividad.</w:t>
+      </w:r>
+    </w:p>
+    <w:p>
+      <w:r>
+        <w:rPr>
+          <w:rFonts w:ascii="Calibri" w:hAnsi="Calibri"/>
+          <w:b/>
+          <w:i w:val="0"/>
+          <w:color w:val="D91023"/>
+          <w:sz w:val="26"/>
+        </w:rPr>
+        <w:t>V · Matriz resumen — indicadores: hoy → meta 2050</w:t>
       </w:r>
     </w:p>
     <w:tbl>
@@ -618,7 +1176,7 @@
                 <w:color w:val="1A2238"/>
                 <w:sz w:val="16"/>
               </w:rPr>
-              <w:t>Participación del área acuícola marina en el área total otorgada</w:t>
+              <w:t>Área acuícola otorgada destinada a actividad marina</w:t>
             </w:r>
           </w:p>
         </w:tc>
@@ -703,7 +1261,7 @@
                 <w:color w:val="1A2238"/>
                 <w:sz w:val="16"/>
               </w:rPr>
-              <w:t>Diagnóstico Comisión Acuicultura - Plan Perú 2040 (15,843.53 ha del área otorgada)</w:t>
+              <w:t>Plan Perú 2040 - Acuicultura, CIP (Diagnóstico)</w:t>
             </w:r>
           </w:p>
         </w:tc>
@@ -722,7 +1280,7 @@
                 <w:color w:val="1A2238"/>
                 <w:sz w:val="16"/>
               </w:rPr>
-              <w:t>Participación del área acuícola continental en el área total otorgada</w:t>
+              <w:t>Área acuícola otorgada destinada a actividad continental</w:t>
             </w:r>
           </w:p>
         </w:tc>
@@ -807,7 +1365,7 @@
                 <w:color w:val="1A2238"/>
                 <w:sz w:val="16"/>
               </w:rPr>
-              <w:t>Diagnóstico Comisión Acuicultura - Plan Perú 2040 (4,891.93 ha del área otorgada)</w:t>
+              <w:t>Plan Perú 2040 - Acuicultura, CIP (Diagnóstico)</w:t>
             </w:r>
           </w:p>
         </w:tc>
@@ -826,7 +1384,7 @@
                 <w:color w:val="1A2238"/>
                 <w:sz w:val="16"/>
               </w:rPr>
-              <w:t>Área otorgada para acuicultura marina</w:t>
+              <w:t>Área acuícola marina otorgada (superficie)</w:t>
             </w:r>
           </w:p>
         </w:tc>
@@ -877,7 +1435,7 @@
                 <w:color w:val="1A2238"/>
                 <w:sz w:val="16"/>
               </w:rPr>
-              <w:t>hectáreas</w:t>
+              <w:t>hectáreas (superficie otorgada)</w:t>
             </w:r>
           </w:p>
         </w:tc>
@@ -911,7 +1469,7 @@
                 <w:color w:val="1A2238"/>
                 <w:sz w:val="16"/>
               </w:rPr>
-              <w:t>Diagnóstico Comisión Acuicultura - Plan Perú 2040</w:t>
+              <w:t>Plan Perú 2040 - Acuicultura, CIP (Diagnóstico)</w:t>
             </w:r>
           </w:p>
         </w:tc>
@@ -930,7 +1488,7 @@
                 <w:color w:val="1A2238"/>
                 <w:sz w:val="16"/>
               </w:rPr>
-              <w:t>Área otorgada para acuicultura continental</w:t>
+              <w:t>Área acuícola continental otorgada (superficie)</w:t>
             </w:r>
           </w:p>
         </w:tc>
@@ -981,7 +1539,7 @@
                 <w:color w:val="1A2238"/>
                 <w:sz w:val="16"/>
               </w:rPr>
-              <w:t>hectáreas</w:t>
+              <w:t>hectáreas (superficie otorgada)</w:t>
             </w:r>
           </w:p>
         </w:tc>
@@ -1015,428 +1573,99 @@
                 <w:color w:val="1A2238"/>
                 <w:sz w:val="16"/>
               </w:rPr>
-              <w:t>Diagnóstico Comisión Acuicultura - Plan Perú 2040</w:t>
-            </w:r>
-          </w:p>
-        </w:tc>
-      </w:tr>
-      <w:tr>
-        <w:tc>
-          <w:tcPr>
-            <w:tcW w:type="dxa" w:w="1656"/>
-          </w:tcPr>
-          <w:p>
-            <w:r>
-              <w:rPr>
-                <w:rFonts w:ascii="Calibri" w:hAnsi="Calibri"/>
-                <w:b/>
-                <w:i w:val="0"/>
-                <w:color w:val="1A2238"/>
-                <w:sz w:val="16"/>
-              </w:rPr>
-              <w:t>Universidades que forman acuicultores</w:t>
-            </w:r>
-          </w:p>
-        </w:tc>
-        <w:tc>
-          <w:tcPr>
-            <w:tcW w:type="dxa" w:w="1656"/>
-          </w:tcPr>
-          <w:p>
-            <w:r>
-              <w:rPr>
-                <w:rFonts w:ascii="Calibri" w:hAnsi="Calibri"/>
-                <w:b w:val="0"/>
-                <w:i w:val="0"/>
-                <w:color w:val="1A2238"/>
-                <w:sz w:val="16"/>
-              </w:rPr>
-              <w:t>3</w:t>
-            </w:r>
-          </w:p>
-        </w:tc>
-        <w:tc>
-          <w:tcPr>
-            <w:tcW w:type="dxa" w:w="1656"/>
-          </w:tcPr>
-          <w:p>
-            <w:r>
-              <w:rPr>
-                <w:rFonts w:ascii="Calibri" w:hAnsi="Calibri"/>
-                <w:b w:val="0"/>
-                <w:i w:val="0"/>
-                <w:color w:val="1A2238"/>
-                <w:sz w:val="16"/>
-              </w:rPr>
-              <w:t>s/d</w:t>
-            </w:r>
-          </w:p>
-        </w:tc>
-        <w:tc>
-          <w:tcPr>
-            <w:tcW w:type="dxa" w:w="1656"/>
-          </w:tcPr>
-          <w:p>
-            <w:r>
-              <w:rPr>
-                <w:rFonts w:ascii="Calibri" w:hAnsi="Calibri"/>
-                <w:b w:val="0"/>
-                <w:i w:val="0"/>
-                <w:color w:val="1A2238"/>
-                <w:sz w:val="16"/>
-              </w:rPr>
-              <w:t>universidades</w:t>
-            </w:r>
-          </w:p>
-        </w:tc>
-        <w:tc>
-          <w:tcPr>
-            <w:tcW w:type="dxa" w:w="1656"/>
-          </w:tcPr>
-          <w:p>
-            <w:r>
-              <w:rPr>
-                <w:rFonts w:ascii="Calibri" w:hAnsi="Calibri"/>
-                <w:b w:val="0"/>
-                <w:i w:val="0"/>
-                <w:color w:val="1A2238"/>
-                <w:sz w:val="16"/>
-              </w:rPr>
-              <w:t>—</w:t>
-            </w:r>
-          </w:p>
-        </w:tc>
-        <w:tc>
-          <w:tcPr>
-            <w:tcW w:type="dxa" w:w="1656"/>
-          </w:tcPr>
-          <w:p>
-            <w:r>
-              <w:rPr>
-                <w:rFonts w:ascii="Calibri" w:hAnsi="Calibri"/>
-                <w:b w:val="0"/>
-                <w:i w:val="0"/>
-                <w:color w:val="1A2238"/>
-                <w:sz w:val="16"/>
-              </w:rPr>
-              <w:t>Diagnóstico Comisión Acuicultura - Plan Perú 2040 (capital humano)</w:t>
-            </w:r>
-          </w:p>
-        </w:tc>
-      </w:tr>
-      <w:tr>
-        <w:tc>
-          <w:tcPr>
-            <w:tcW w:type="dxa" w:w="1656"/>
-          </w:tcPr>
-          <w:p>
-            <w:r>
-              <w:rPr>
-                <w:rFonts w:ascii="Calibri" w:hAnsi="Calibri"/>
-                <w:b/>
-                <w:i w:val="0"/>
-                <w:color w:val="1A2238"/>
-                <w:sz w:val="16"/>
-              </w:rPr>
-              <w:t>Universidades que forman ingenieros pesqueros y biólogos capacitados para la acuicultura</w:t>
-            </w:r>
-          </w:p>
-        </w:tc>
-        <w:tc>
-          <w:tcPr>
-            <w:tcW w:type="dxa" w:w="1656"/>
-          </w:tcPr>
-          <w:p>
-            <w:r>
-              <w:rPr>
-                <w:rFonts w:ascii="Calibri" w:hAnsi="Calibri"/>
-                <w:b w:val="0"/>
-                <w:i w:val="0"/>
-                <w:color w:val="1A2238"/>
-                <w:sz w:val="16"/>
-              </w:rPr>
-              <w:t>10</w:t>
-            </w:r>
-          </w:p>
-        </w:tc>
-        <w:tc>
-          <w:tcPr>
-            <w:tcW w:type="dxa" w:w="1656"/>
-          </w:tcPr>
-          <w:p>
-            <w:r>
-              <w:rPr>
-                <w:rFonts w:ascii="Calibri" w:hAnsi="Calibri"/>
-                <w:b w:val="0"/>
-                <w:i w:val="0"/>
-                <w:color w:val="1A2238"/>
-                <w:sz w:val="16"/>
-              </w:rPr>
-              <w:t>s/d</w:t>
-            </w:r>
-          </w:p>
-        </w:tc>
-        <w:tc>
-          <w:tcPr>
-            <w:tcW w:type="dxa" w:w="1656"/>
-          </w:tcPr>
-          <w:p>
-            <w:r>
-              <w:rPr>
-                <w:rFonts w:ascii="Calibri" w:hAnsi="Calibri"/>
-                <w:b w:val="0"/>
-                <w:i w:val="0"/>
-                <w:color w:val="1A2238"/>
-                <w:sz w:val="16"/>
-              </w:rPr>
-              <w:t>universidades</w:t>
-            </w:r>
-          </w:p>
-        </w:tc>
-        <w:tc>
-          <w:tcPr>
-            <w:tcW w:type="dxa" w:w="1656"/>
-          </w:tcPr>
-          <w:p>
-            <w:r>
-              <w:rPr>
-                <w:rFonts w:ascii="Calibri" w:hAnsi="Calibri"/>
-                <w:b w:val="0"/>
-                <w:i w:val="0"/>
-                <w:color w:val="1A2238"/>
-                <w:sz w:val="16"/>
-              </w:rPr>
-              <w:t>—</w:t>
-            </w:r>
-          </w:p>
-        </w:tc>
-        <w:tc>
-          <w:tcPr>
-            <w:tcW w:type="dxa" w:w="1656"/>
-          </w:tcPr>
-          <w:p>
-            <w:r>
-              <w:rPr>
-                <w:rFonts w:ascii="Calibri" w:hAnsi="Calibri"/>
-                <w:b w:val="0"/>
-                <w:i w:val="0"/>
-                <w:color w:val="1A2238"/>
-                <w:sz w:val="16"/>
-              </w:rPr>
-              <w:t>Diagnóstico Comisión Acuicultura - Plan Perú 2040 (capital humano)</w:t>
-            </w:r>
-          </w:p>
-        </w:tc>
-      </w:tr>
-      <w:tr>
-        <w:tc>
-          <w:tcPr>
-            <w:tcW w:type="dxa" w:w="1656"/>
-          </w:tcPr>
-          <w:p>
-            <w:r>
-              <w:rPr>
-                <w:rFonts w:ascii="Calibri" w:hAnsi="Calibri"/>
-                <w:b/>
-                <w:i w:val="0"/>
-                <w:color w:val="1A2238"/>
-                <w:sz w:val="16"/>
-              </w:rPr>
-              <w:t>Centros de enseñanza media especializada que forman técnicos en acuicultura</w:t>
-            </w:r>
-          </w:p>
-        </w:tc>
-        <w:tc>
-          <w:tcPr>
-            <w:tcW w:type="dxa" w:w="1656"/>
-          </w:tcPr>
-          <w:p>
-            <w:r>
-              <w:rPr>
-                <w:rFonts w:ascii="Calibri" w:hAnsi="Calibri"/>
-                <w:b w:val="0"/>
-                <w:i w:val="0"/>
-                <w:color w:val="1A2238"/>
-                <w:sz w:val="16"/>
-              </w:rPr>
-              <w:t>2</w:t>
-            </w:r>
-          </w:p>
-        </w:tc>
-        <w:tc>
-          <w:tcPr>
-            <w:tcW w:type="dxa" w:w="1656"/>
-          </w:tcPr>
-          <w:p>
-            <w:r>
-              <w:rPr>
-                <w:rFonts w:ascii="Calibri" w:hAnsi="Calibri"/>
-                <w:b w:val="0"/>
-                <w:i w:val="0"/>
-                <w:color w:val="1A2238"/>
-                <w:sz w:val="16"/>
-              </w:rPr>
-              <w:t>s/d</w:t>
-            </w:r>
-          </w:p>
-        </w:tc>
-        <w:tc>
-          <w:tcPr>
-            <w:tcW w:type="dxa" w:w="1656"/>
-          </w:tcPr>
-          <w:p>
-            <w:r>
-              <w:rPr>
-                <w:rFonts w:ascii="Calibri" w:hAnsi="Calibri"/>
-                <w:b w:val="0"/>
-                <w:i w:val="0"/>
-                <w:color w:val="1A2238"/>
-                <w:sz w:val="16"/>
-              </w:rPr>
-              <w:t>centros</w:t>
-            </w:r>
-          </w:p>
-        </w:tc>
-        <w:tc>
-          <w:tcPr>
-            <w:tcW w:type="dxa" w:w="1656"/>
-          </w:tcPr>
-          <w:p>
-            <w:r>
-              <w:rPr>
-                <w:rFonts w:ascii="Calibri" w:hAnsi="Calibri"/>
-                <w:b w:val="0"/>
-                <w:i w:val="0"/>
-                <w:color w:val="1A2238"/>
-                <w:sz w:val="16"/>
-              </w:rPr>
-              <w:t>—</w:t>
-            </w:r>
-          </w:p>
-        </w:tc>
-        <w:tc>
-          <w:tcPr>
-            <w:tcW w:type="dxa" w:w="1656"/>
-          </w:tcPr>
-          <w:p>
-            <w:r>
-              <w:rPr>
-                <w:rFonts w:ascii="Calibri" w:hAnsi="Calibri"/>
-                <w:b w:val="0"/>
-                <w:i w:val="0"/>
-                <w:color w:val="1A2238"/>
-                <w:sz w:val="16"/>
-              </w:rPr>
-              <w:t>Diagnóstico Comisión Acuicultura - Plan Perú 2040 (capital humano)</w:t>
-            </w:r>
-          </w:p>
-        </w:tc>
-      </w:tr>
-      <w:tr>
-        <w:tc>
-          <w:tcPr>
-            <w:tcW w:type="dxa" w:w="1656"/>
-          </w:tcPr>
-          <w:p>
-            <w:r>
-              <w:rPr>
-                <w:rFonts w:ascii="Calibri" w:hAnsi="Calibri"/>
-                <w:b/>
-                <w:i w:val="0"/>
-                <w:color w:val="1A2238"/>
-                <w:sz w:val="16"/>
-              </w:rPr>
-              <w:t>Empresas nacionales líderes productoras de alimento estandarizado para langostinos y truchas</w:t>
-            </w:r>
-          </w:p>
-        </w:tc>
-        <w:tc>
-          <w:tcPr>
-            <w:tcW w:type="dxa" w:w="1656"/>
-          </w:tcPr>
-          <w:p>
-            <w:r>
-              <w:rPr>
-                <w:rFonts w:ascii="Calibri" w:hAnsi="Calibri"/>
-                <w:b w:val="0"/>
-                <w:i w:val="0"/>
-                <w:color w:val="1A2238"/>
-                <w:sz w:val="16"/>
-              </w:rPr>
-              <w:t>2</w:t>
-            </w:r>
-          </w:p>
-        </w:tc>
-        <w:tc>
-          <w:tcPr>
-            <w:tcW w:type="dxa" w:w="1656"/>
-          </w:tcPr>
-          <w:p>
-            <w:r>
-              <w:rPr>
-                <w:rFonts w:ascii="Calibri" w:hAnsi="Calibri"/>
-                <w:b w:val="0"/>
-                <w:i w:val="0"/>
-                <w:color w:val="1A2238"/>
-                <w:sz w:val="16"/>
-              </w:rPr>
-              <w:t>s/d</w:t>
-            </w:r>
-          </w:p>
-        </w:tc>
-        <w:tc>
-          <w:tcPr>
-            <w:tcW w:type="dxa" w:w="1656"/>
-          </w:tcPr>
-          <w:p>
-            <w:r>
-              <w:rPr>
-                <w:rFonts w:ascii="Calibri" w:hAnsi="Calibri"/>
-                <w:b w:val="0"/>
-                <w:i w:val="0"/>
-                <w:color w:val="1A2238"/>
-                <w:sz w:val="16"/>
-              </w:rPr>
-              <w:t>empresas</w:t>
-            </w:r>
-          </w:p>
-        </w:tc>
-        <w:tc>
-          <w:tcPr>
-            <w:tcW w:type="dxa" w:w="1656"/>
-          </w:tcPr>
-          <w:p>
-            <w:r>
-              <w:rPr>
-                <w:rFonts w:ascii="Calibri" w:hAnsi="Calibri"/>
-                <w:b w:val="0"/>
-                <w:i w:val="0"/>
-                <w:color w:val="1A2238"/>
-                <w:sz w:val="16"/>
-              </w:rPr>
-              <w:t>—</w:t>
-            </w:r>
-          </w:p>
-        </w:tc>
-        <w:tc>
-          <w:tcPr>
-            <w:tcW w:type="dxa" w:w="1656"/>
-          </w:tcPr>
-          <w:p>
-            <w:r>
-              <w:rPr>
-                <w:rFonts w:ascii="Calibri" w:hAnsi="Calibri"/>
-                <w:b w:val="0"/>
-                <w:i w:val="0"/>
-                <w:color w:val="1A2238"/>
-                <w:sz w:val="16"/>
-              </w:rPr>
-              <w:t>Diagnóstico Comisión Acuicultura - Plan Perú 2040 (insumo alimento/piensos)</w:t>
+              <w:t>Plan Perú 2040 - Acuicultura, CIP (Diagnóstico)</w:t>
             </w:r>
           </w:p>
         </w:tc>
       </w:tr>
     </w:tbl>
+    <w:p>
+      <w:r>
+        <w:rPr>
+          <w:rFonts w:ascii="Calibri" w:hAnsi="Calibri"/>
+          <w:b/>
+          <w:i w:val="0"/>
+          <w:color w:val="D91023"/>
+          <w:sz w:val="26"/>
+        </w:rPr>
+        <w:t>VII · Articulación con el Acuerdo Nacional y el PEDN al 2050</w:t>
+      </w:r>
+    </w:p>
+    <w:p>
+      <w:pPr>
+        <w:pStyle w:val="ListBullet"/>
+      </w:pPr>
+      <w:r>
+        <w:rPr>
+          <w:rFonts w:ascii="Calibri" w:hAnsi="Calibri"/>
+          <w:b w:val="0"/>
+          <w:i w:val="0"/>
+          <w:color w:val="1A2238"/>
+          <w:sz w:val="21"/>
+        </w:rPr>
+        <w:t>Acuerdo Nacional - Décimo Quinta Política de Estado: Promoción de la Seguridad Alimentaria y Nutrición (alentar una producción de alimentos sostenible y diversificada, garantizar alimentos asequibles y suficientes, asegurar el acceso a alimentos y nutrición adecuada para grupos vulnerables).</w:t>
+      </w:r>
+    </w:p>
+    <w:p>
+      <w:pPr>
+        <w:pStyle w:val="ListBullet"/>
+      </w:pPr>
+      <w:r>
+        <w:rPr>
+          <w:rFonts w:ascii="Calibri" w:hAnsi="Calibri"/>
+          <w:b w:val="0"/>
+          <w:i w:val="0"/>
+          <w:color w:val="1A2238"/>
+          <w:sz w:val="21"/>
+        </w:rPr>
+        <w:t>Plan Bicentenario: El Perú hacia el 2021 (CEPLAN, D.S. 054-2011-PCM): visión de economía dinámica, diversificada y de alto nivel tecnológico, con aprovechamiento sostenible de recursos naturales; reconoce el gran potencial de la acuicultura en aguas continentales, especialmente en la región amazónica.</w:t>
+      </w:r>
+    </w:p>
+    <w:p>
+      <w:pPr>
+        <w:pStyle w:val="ListBullet"/>
+      </w:pPr>
+      <w:r>
+        <w:rPr>
+          <w:rFonts w:ascii="Calibri" w:hAnsi="Calibri"/>
+          <w:b w:val="0"/>
+          <w:i w:val="0"/>
+          <w:color w:val="1A2238"/>
+          <w:sz w:val="21"/>
+        </w:rPr>
+        <w:t>Declaración y Estrategia de Bangkok (NACA-FAO, 2000): desarrollo del sector acuícola para contribuir a la disponibilidad de alimentos, seguridad alimentaria, crecimiento económico, comercio y mejora de niveles de vida.</w:t>
+      </w:r>
+    </w:p>
+    <w:p>
+      <w:pPr>
+        <w:pStyle w:val="ListBullet"/>
+      </w:pPr>
+      <w:r>
+        <w:rPr>
+          <w:rFonts w:ascii="Calibri" w:hAnsi="Calibri"/>
+          <w:b w:val="0"/>
+          <w:i w:val="0"/>
+          <w:color w:val="1A2238"/>
+          <w:sz w:val="21"/>
+        </w:rPr>
+        <w:t>Código de Conducta para la Pesca Responsable (FAO), Artículo 9 'Desarrollo de la Acuicultura': medidas de gestión eficaces, prácticas y costo-efectivas.</w:t>
+      </w:r>
+    </w:p>
+    <w:p>
+      <w:pPr>
+        <w:pStyle w:val="ListBullet"/>
+      </w:pPr>
+      <w:r>
+        <w:rPr>
+          <w:rFonts w:ascii="Calibri" w:hAnsi="Calibri"/>
+          <w:b w:val="0"/>
+          <w:i w:val="0"/>
+          <w:color w:val="1A2238"/>
+          <w:sz w:val="21"/>
+        </w:rPr>
+        <w:t>Enfoque Ecosistémico para la Acuicultura (EEA) y principio precautorio para minimizar impactos ambientales.</w:t>
+      </w:r>
+    </w:p>
     <w:p>
       <w:r>
         <w:rPr>
@@ -1458,7 +1687,7 @@
           <w:color w:val="1A2238"/>
           <w:sz w:val="21"/>
         </w:rPr>
-        <w:t xml:space="preserve">Incremento de la producción y comercialización acuícola: </w:t>
+        <w:t xml:space="preserve">Voluntad política: </w:t>
       </w:r>
       <w:r>
         <w:rPr>
@@ -1468,7 +1697,7 @@
           <w:color w:val="1A2238"/>
           <w:sz w:val="21"/>
         </w:rPr>
-        <w:t>Incrementar la calidad, productividad y el volumen de producción acuícola comercializado a nivel nacional e internacional, apoyando capacidades exportadoras (productos orgánicos), posicionamiento internacional con PROMPERU y MINCETUR, desarrollo del mercado interno, aseguramiento y control de calidad (SANIPES) y normas técnicas (Objetivo N°1).</w:t>
+        <w:t>Voluntad política que trascienda los periodos gubernamentales para garantizar las inversiones dirigidas al desarrollo de la acuicultura.</w:t>
       </w:r>
     </w:p>
     <w:p>
@@ -1480,7 +1709,7 @@
           <w:color w:val="1A2238"/>
           <w:sz w:val="21"/>
         </w:rPr>
-        <w:t xml:space="preserve">Inversión privada y ordenamiento de la actividad: </w:t>
+        <w:t xml:space="preserve">Capital humano: </w:t>
       </w:r>
       <w:r>
         <w:rPr>
@@ -1490,7 +1719,7 @@
           <w:color w:val="1A2238"/>
           <w:sz w:val="21"/>
         </w:rPr>
-        <w:t>Incrementar la inversión privada en acuicultura fomentando la viabilidad económica y competitividad de las granjas, la organización y gestión empresarial de pequeños y medianos acuicultores, el Catastro Acuícola Nacional y sistema de información geográfica, la infraestructura de comunicaciones y servicios, la simplificación de trámites (Ventanilla Única de Acuicultura), la estabilidad jurídica de áreas acuáticas y el ordenamiento territorial (Objetivo N°2).</w:t>
+        <w:t>Capital humano como factor primordial de la transformación, priorizando su competencia y probidad en el sector público y privado.</w:t>
       </w:r>
     </w:p>
     <w:p>
@@ -1502,7 +1731,7 @@
           <w:color w:val="1A2238"/>
           <w:sz w:val="21"/>
         </w:rPr>
-        <w:t xml:space="preserve">Producción nacional de insumos (semillas y alimento balanceado): </w:t>
+        <w:t xml:space="preserve">Ciencia, tecnología e innovación (CTI): </w:t>
       </w:r>
       <w:r>
         <w:rPr>
@@ -1512,7 +1741,7 @@
           <w:color w:val="1A2238"/>
           <w:sz w:val="21"/>
         </w:rPr>
-        <w:t>Promover la producción nacional de insumos mejorando los centros de producción acuícola estatales (vía gobiernos regionales, sector privado o APP) para abastecer semilla de calidad, y promoviendo alimento balanceado de buena calidad con normas técnicas y plantas piloto (Objetivo N°3).</w:t>
+        <w:t>Uso de avances tecnológicos en la gestión pública y privada; la acuicultura requiere CTI por ser una actividad de riesgo.</w:t>
       </w:r>
     </w:p>
     <w:p>
@@ -1524,7 +1753,7 @@
           <w:color w:val="1A2238"/>
           <w:sz w:val="21"/>
         </w:rPr>
-        <w:t xml:space="preserve">Formación, capacitación y asistencia técnica: </w:t>
+        <w:t xml:space="preserve">Inversión privada y del Estado en CTI: </w:t>
       </w:r>
       <w:r>
         <w:rPr>
@@ -1534,7 +1763,7 @@
           <w:color w:val="1A2238"/>
           <w:sz w:val="21"/>
         </w:rPr>
-        <w:t>Promover el desarrollo de servicios de formación, capacitación y asistencia técnica para la producción y comercialización acuícola, con programas de extensión en las Regiones, protocolos de buenas prácticas en granjas demostrativas y mejora de la formación universitaria y de postgrado (Objetivo N°4).</w:t>
+        <w:t>Inversiones de ambas partes, asumiendo el Estado la inversión de mayor riesgo y de resultados de largo plazo.</w:t>
       </w:r>
     </w:p>
     <w:p>
@@ -1546,7 +1775,7 @@
           <w:color w:val="1A2238"/>
           <w:sz w:val="21"/>
         </w:rPr>
-        <w:t xml:space="preserve">Control y sanidad acuícola: </w:t>
+        <w:t xml:space="preserve">Sostenibilidad ambiental: </w:t>
       </w:r>
       <w:r>
         <w:rPr>
@@ -1556,592 +1785,7 @@
           <w:color w:val="1A2238"/>
           <w:sz w:val="21"/>
         </w:rPr>
-        <w:t>Promover el desarrollo de servicios de control sanitario, estableciendo un sistema nacional de sanidad acuícola con centros de referencia equipados para prevenir y controlar enfermedades y responder a brotes de epizootias, y regular la prestación de servicios de sanidad acuícola (Objetivo N°5).</w:t>
-      </w:r>
-    </w:p>
-    <w:p>
-      <w:r>
-        <w:rPr>
-          <w:rFonts w:ascii="Calibri" w:hAnsi="Calibri"/>
-          <w:b/>
-          <w:i w:val="0"/>
-          <w:color w:val="1A2238"/>
-          <w:sz w:val="21"/>
-        </w:rPr>
-        <w:t xml:space="preserve">Investigación, desarrollo y transferencia tecnológica: </w:t>
-      </w:r>
-      <w:r>
-        <w:rPr>
-          <w:rFonts w:ascii="Calibri" w:hAnsi="Calibri"/>
-          <w:b w:val="0"/>
-          <w:i w:val="0"/>
-          <w:color w:val="1A2238"/>
-          <w:sz w:val="21"/>
-        </w:rPr>
-        <w:t>Promover la investigación y desarrollo, adaptación y transferencia tecnológica en materia acuícola, estableciendo prioridades de investigación por especies, desarrollando tecnologías para producción nacional de semilla de calidad y articulando institutos de investigación con empresas y gremios (Objetivo N°6).</w:t>
-      </w:r>
-    </w:p>
-    <w:p>
-      <w:r>
-        <w:rPr>
-          <w:rFonts w:ascii="Calibri" w:hAnsi="Calibri"/>
-          <w:b/>
-          <w:i w:val="0"/>
-          <w:color w:val="1A2238"/>
-          <w:sz w:val="21"/>
-        </w:rPr>
-        <w:t xml:space="preserve">Capacidades institucionales y estadística: </w:t>
-      </w:r>
-      <w:r>
-        <w:rPr>
-          <w:rFonts w:ascii="Calibri" w:hAnsi="Calibri"/>
-          <w:b w:val="0"/>
-          <w:i w:val="0"/>
-          <w:color w:val="1A2238"/>
-          <w:sz w:val="21"/>
-        </w:rPr>
-        <w:t>Contar con una estructura organizacional y capacidades humanas adecuadas para la elaboración, implementación y evaluación de políticas de promoción acuícola, fortaleciendo recursos humanos de ordenación y desarrollo, y el sistema de captación y difusión de información estadística representativa, veraz y oportuna (Objetivo N°7).</w:t>
-      </w:r>
-    </w:p>
-    <w:p>
-      <w:r>
-        <w:rPr>
-          <w:rFonts w:ascii="Calibri" w:hAnsi="Calibri"/>
-          <w:b/>
-          <w:i w:val="0"/>
-          <w:color w:val="1A2238"/>
-          <w:sz w:val="21"/>
-        </w:rPr>
-        <w:t xml:space="preserve">Financiamiento de la acuicultura: </w:t>
-      </w:r>
-      <w:r>
-        <w:rPr>
-          <w:rFonts w:ascii="Calibri" w:hAnsi="Calibri"/>
-          <w:b w:val="0"/>
-          <w:i w:val="0"/>
-          <w:color w:val="1A2238"/>
-          <w:sz w:val="21"/>
-        </w:rPr>
-        <w:t>Obtener y usar óptimamente recursos financieros para la promoción de la acuicultura, analizando, diseñando e implementando instrumentos para el incremento, distribución y óptimo uso de los recursos financieros para el desarrollo del sector (Objetivo N°8).</w:t>
-      </w:r>
-    </w:p>
-    <w:p>
-      <w:r>
-        <w:rPr>
-          <w:rFonts w:ascii="Calibri" w:hAnsi="Calibri"/>
-          <w:b/>
-          <w:i w:val="0"/>
-          <w:color w:val="D91023"/>
-          <w:sz w:val="26"/>
-        </w:rPr>
-        <w:t>Metas 2050</w:t>
-      </w:r>
-    </w:p>
-    <w:p>
-      <w:pPr>
-        <w:pStyle w:val="ListBullet"/>
-      </w:pPr>
-      <w:r>
-        <w:rPr>
-          <w:rFonts w:ascii="Calibri" w:hAnsi="Calibri"/>
-          <w:b w:val="0"/>
-          <w:i w:val="0"/>
-          <w:color w:val="1A2238"/>
-          <w:sz w:val="21"/>
-        </w:rPr>
-        <w:t>Incrementar la calidad, productividad y el volumen de producción acuícola comercializado a nivel nacional e internacional.</w:t>
-      </w:r>
-    </w:p>
-    <w:p>
-      <w:pPr>
-        <w:pStyle w:val="ListBullet"/>
-      </w:pPr>
-      <w:r>
-        <w:rPr>
-          <w:rFonts w:ascii="Calibri" w:hAnsi="Calibri"/>
-          <w:b w:val="0"/>
-          <w:i w:val="0"/>
-          <w:color w:val="1A2238"/>
-          <w:sz w:val="21"/>
-        </w:rPr>
-        <w:t>Incrementar la inversión privada en acuicultura.</w:t>
-      </w:r>
-    </w:p>
-    <w:p>
-      <w:pPr>
-        <w:pStyle w:val="ListBullet"/>
-      </w:pPr>
-      <w:r>
-        <w:rPr>
-          <w:rFonts w:ascii="Calibri" w:hAnsi="Calibri"/>
-          <w:b w:val="0"/>
-          <w:i w:val="0"/>
-          <w:color w:val="1A2238"/>
-          <w:sz w:val="21"/>
-        </w:rPr>
-        <w:t>Promover la producción nacional de insumos (semillas y alimento balanceado) para la acuicultura, reduciendo la dependencia de la importación de nauplios, postlarvas y ovas embrionadas.</w:t>
-      </w:r>
-    </w:p>
-    <w:p>
-      <w:pPr>
-        <w:pStyle w:val="ListBullet"/>
-      </w:pPr>
-      <w:r>
-        <w:rPr>
-          <w:rFonts w:ascii="Calibri" w:hAnsi="Calibri"/>
-          <w:b w:val="0"/>
-          <w:i w:val="0"/>
-          <w:color w:val="1A2238"/>
-          <w:sz w:val="21"/>
-        </w:rPr>
-        <w:t>Crear el Instituto Nacional de Acuicultura.</w:t>
-      </w:r>
-    </w:p>
-    <w:p>
-      <w:pPr>
-        <w:pStyle w:val="ListBullet"/>
-      </w:pPr>
-      <w:r>
-        <w:rPr>
-          <w:rFonts w:ascii="Calibri" w:hAnsi="Calibri"/>
-          <w:b w:val="0"/>
-          <w:i w:val="0"/>
-          <w:color w:val="1A2238"/>
-          <w:sz w:val="21"/>
-        </w:rPr>
-        <w:t>Establecer un sistema nacional de sanidad acuícola con centros de referencia para prevenir y controlar enfermedades y responder a epizootias.</w:t>
-      </w:r>
-    </w:p>
-    <w:p>
-      <w:pPr>
-        <w:pStyle w:val="ListBullet"/>
-      </w:pPr>
-      <w:r>
-        <w:rPr>
-          <w:rFonts w:ascii="Calibri" w:hAnsi="Calibri"/>
-          <w:b w:val="0"/>
-          <w:i w:val="0"/>
-          <w:color w:val="1A2238"/>
-          <w:sz w:val="21"/>
-        </w:rPr>
-        <w:t>Contar con un Catastro Acuícola Nacional actualizado, descentralizado e interconectado con las regiones, con sistema de información geográfica.</w:t>
-      </w:r>
-    </w:p>
-    <w:p>
-      <w:pPr>
-        <w:pStyle w:val="ListBullet"/>
-      </w:pPr>
-      <w:r>
-        <w:rPr>
-          <w:rFonts w:ascii="Calibri" w:hAnsi="Calibri"/>
-          <w:b w:val="0"/>
-          <w:i w:val="0"/>
-          <w:color w:val="1A2238"/>
-          <w:sz w:val="21"/>
-        </w:rPr>
-        <w:t>Optimizar la Ventanilla Única de Acuicultura (VUA) mediante simplificación de trámites para el otorgamiento de derechos a mayor y menor escala.</w:t>
-      </w:r>
-    </w:p>
-    <w:p>
-      <w:pPr>
-        <w:pStyle w:val="ListBullet"/>
-      </w:pPr>
-      <w:r>
-        <w:rPr>
-          <w:rFonts w:ascii="Calibri" w:hAnsi="Calibri"/>
-          <w:b w:val="0"/>
-          <w:i w:val="0"/>
-          <w:color w:val="1A2238"/>
-          <w:sz w:val="21"/>
-        </w:rPr>
-        <w:t>Promover el ordenamiento territorial que favorezca la expansión de la acuicultura evitando conflictos por el uso de áreas acuáticas.</w:t>
-      </w:r>
-    </w:p>
-    <w:p>
-      <w:pPr>
-        <w:pStyle w:val="ListBullet"/>
-      </w:pPr>
-      <w:r>
-        <w:rPr>
-          <w:rFonts w:ascii="Calibri" w:hAnsi="Calibri"/>
-          <w:b w:val="0"/>
-          <w:i w:val="0"/>
-          <w:color w:val="1A2238"/>
-          <w:sz w:val="21"/>
-        </w:rPr>
-        <w:t>Obtener y usar óptimamente recursos financieros para la promoción de la acuicultura.</w:t>
-      </w:r>
-    </w:p>
-    <w:p>
-      <w:pPr>
-        <w:pStyle w:val="ListBullet"/>
-      </w:pPr>
-      <w:r>
-        <w:rPr>
-          <w:rFonts w:ascii="Calibri" w:hAnsi="Calibri"/>
-          <w:b w:val="0"/>
-          <w:i w:val="0"/>
-          <w:color w:val="1A2238"/>
-          <w:sz w:val="21"/>
-        </w:rPr>
-        <w:t>Buscar el equilibrio entre la pesca extractiva y la actividad acuícola, así como con otras actividades que usan los recursos hídricos.</w:t>
-      </w:r>
-    </w:p>
-    <w:p>
-      <w:pPr>
-        <w:pStyle w:val="ListBullet"/>
-      </w:pPr>
-      <w:r>
-        <w:rPr>
-          <w:rFonts w:ascii="Calibri" w:hAnsi="Calibri"/>
-          <w:b w:val="0"/>
-          <w:i w:val="0"/>
-          <w:color w:val="1A2238"/>
-          <w:sz w:val="21"/>
-        </w:rPr>
-        <w:t>Alcanzar la visión al 2040 de una acuicultura como eje económico basado en la biodiversidad, con oferta exportable de valor agregado.</w:t>
-      </w:r>
-    </w:p>
-    <w:p>
-      <w:r>
-        <w:rPr>
-          <w:rFonts w:ascii="Calibri" w:hAnsi="Calibri"/>
-          <w:b/>
-          <w:i w:val="0"/>
-          <w:color w:val="D91023"/>
-          <w:sz w:val="26"/>
-        </w:rPr>
-        <w:t>Acciones e iniciativas</w:t>
-      </w:r>
-    </w:p>
-    <w:p>
-      <w:pPr>
-        <w:pStyle w:val="ListBullet"/>
-      </w:pPr>
-      <w:r>
-        <w:rPr>
-          <w:rFonts w:ascii="Calibri" w:hAnsi="Calibri"/>
-          <w:b w:val="0"/>
-          <w:i w:val="0"/>
-          <w:color w:val="1A2238"/>
-          <w:sz w:val="21"/>
-        </w:rPr>
-        <w:t>Apoyar el desarrollo de capacidades exportadoras de empresas productoras acuícolas orgánicas con información comercial y asesoría, y propiciar la asociatividad entre empresas para acceder al mercado de exportación.</w:t>
-      </w:r>
-    </w:p>
-    <w:p>
-      <w:pPr>
-        <w:pStyle w:val="ListBullet"/>
-      </w:pPr>
-      <w:r>
-        <w:rPr>
-          <w:rFonts w:ascii="Calibri" w:hAnsi="Calibri"/>
-          <w:b w:val="0"/>
-          <w:i w:val="0"/>
-          <w:color w:val="1A2238"/>
-          <w:sz w:val="21"/>
-        </w:rPr>
-        <w:t>Posicionar y fortalecer los productos acuícolas en mercados internacionales mediante promoción comercial de PROMPERU con apoyo del Ministerio de Comercio Exterior y Turismo.</w:t>
-      </w:r>
-    </w:p>
-    <w:p>
-      <w:pPr>
-        <w:pStyle w:val="ListBullet"/>
-      </w:pPr>
-      <w:r>
-        <w:rPr>
-          <w:rFonts w:ascii="Calibri" w:hAnsi="Calibri"/>
-          <w:b w:val="0"/>
-          <w:i w:val="0"/>
-          <w:color w:val="1A2238"/>
-          <w:sz w:val="21"/>
-        </w:rPr>
-        <w:t>Desarrollar el mercado interno para productos de la acuicultura, capacitando personal en manipulación de productos pesqueros y desarrollando infraestructura de mercadeo.</w:t>
-      </w:r>
-    </w:p>
-    <w:p>
-      <w:pPr>
-        <w:pStyle w:val="ListBullet"/>
-      </w:pPr>
-      <w:r>
-        <w:rPr>
-          <w:rFonts w:ascii="Calibri" w:hAnsi="Calibri"/>
-          <w:b w:val="0"/>
-          <w:i w:val="0"/>
-          <w:color w:val="1A2238"/>
-          <w:sz w:val="21"/>
-        </w:rPr>
-        <w:t>Fortalecer el aseguramiento y control de la calidad e inocuidad capacitando a SANIPES y a capacitadores, usando el manual de inocuidad y control de calidad.</w:t>
-      </w:r>
-    </w:p>
-    <w:p>
-      <w:pPr>
-        <w:pStyle w:val="ListBullet"/>
-      </w:pPr>
-      <w:r>
-        <w:rPr>
-          <w:rFonts w:ascii="Calibri" w:hAnsi="Calibri"/>
-          <w:b w:val="0"/>
-          <w:i w:val="0"/>
-          <w:color w:val="1A2238"/>
-          <w:sz w:val="21"/>
-        </w:rPr>
-        <w:t>Promover el diseño de normas técnicas para la acuicultura orientadas al posicionamiento en nuevos mercados.</w:t>
-      </w:r>
-    </w:p>
-    <w:p>
-      <w:pPr>
-        <w:pStyle w:val="ListBullet"/>
-      </w:pPr>
-      <w:r>
-        <w:rPr>
-          <w:rFonts w:ascii="Calibri" w:hAnsi="Calibri"/>
-          <w:b w:val="0"/>
-          <w:i w:val="0"/>
-          <w:color w:val="1A2238"/>
-          <w:sz w:val="21"/>
-        </w:rPr>
-        <w:t>Fomentar la viabilidad económica, competitividad, capacidad de gestión y formalidad de las granjas y de los productores de menor escala y subsistencia mediante capacitación y asistencia técnica.</w:t>
-      </w:r>
-    </w:p>
-    <w:p>
-      <w:pPr>
-        <w:pStyle w:val="ListBullet"/>
-      </w:pPr>
-      <w:r>
-        <w:rPr>
-          <w:rFonts w:ascii="Calibri" w:hAnsi="Calibri"/>
-          <w:b w:val="0"/>
-          <w:i w:val="0"/>
-          <w:color w:val="1A2238"/>
-          <w:sz w:val="21"/>
-        </w:rPr>
-        <w:t>Fomentar la organización y gestión empresarial de pequeños y medianos acuicultores para que se agrupen en gremios o asociaciones.</w:t>
-      </w:r>
-    </w:p>
-    <w:p>
-      <w:pPr>
-        <w:pStyle w:val="ListBullet"/>
-      </w:pPr>
-      <w:r>
-        <w:rPr>
-          <w:rFonts w:ascii="Calibri" w:hAnsi="Calibri"/>
-          <w:b w:val="0"/>
-          <w:i w:val="0"/>
-          <w:color w:val="1A2238"/>
-          <w:sz w:val="21"/>
-        </w:rPr>
-        <w:t>Implementar un sistema de información geográfica y el Catastro Acuícola Nacional, evaluando los cuerpos de agua más importantes e interconectándolo con las regiones mediante un software adecuado.</w:t>
-      </w:r>
-    </w:p>
-    <w:p>
-      <w:pPr>
-        <w:pStyle w:val="ListBullet"/>
-      </w:pPr>
-      <w:r>
-        <w:rPr>
-          <w:rFonts w:ascii="Calibri" w:hAnsi="Calibri"/>
-          <w:b w:val="0"/>
-          <w:i w:val="0"/>
-          <w:color w:val="1A2238"/>
-          <w:sz w:val="21"/>
-        </w:rPr>
-        <w:t>Mejorar la infraestructura de comunicaciones, vías de acceso, cadenas de frío, energía y servicios básicos en zonas de desarrollo acuícola, gestionando ante Gobiernos Regionales, APP y empresas.</w:t>
-      </w:r>
-    </w:p>
-    <w:p>
-      <w:pPr>
-        <w:pStyle w:val="ListBullet"/>
-      </w:pPr>
-      <w:r>
-        <w:rPr>
-          <w:rFonts w:ascii="Calibri" w:hAnsi="Calibri"/>
-          <w:b w:val="0"/>
-          <w:i w:val="0"/>
-          <w:color w:val="1A2238"/>
-          <w:sz w:val="21"/>
-        </w:rPr>
-        <w:t>Simplificar trámites para el otorgamiento de derechos (mayor y menor escala) optimizando la Ventanilla Única de Acuicultura (VUA) y fortalecer la estabilidad jurídica y derechos de uso de áreas acuáticas.</w:t>
-      </w:r>
-    </w:p>
-    <w:p>
-      <w:pPr>
-        <w:pStyle w:val="ListBullet"/>
-      </w:pPr>
-      <w:r>
-        <w:rPr>
-          <w:rFonts w:ascii="Calibri" w:hAnsi="Calibri"/>
-          <w:b w:val="0"/>
-          <w:i w:val="0"/>
-          <w:color w:val="1A2238"/>
-          <w:sz w:val="21"/>
-        </w:rPr>
-        <w:t>Promover el ordenamiento territorial que favorezca la expansión de la acuicultura evitando conflictos por uso de áreas acuáticas.</w:t>
-      </w:r>
-    </w:p>
-    <w:p>
-      <w:pPr>
-        <w:pStyle w:val="ListBullet"/>
-      </w:pPr>
-      <w:r>
-        <w:rPr>
-          <w:rFonts w:ascii="Calibri" w:hAnsi="Calibri"/>
-          <w:b w:val="0"/>
-          <w:i w:val="0"/>
-          <w:color w:val="1A2238"/>
-          <w:sz w:val="21"/>
-        </w:rPr>
-        <w:t>Mejorar los centros de producción acuícola estatales (vía gobiernos regionales, sector privado o APP) para abastecer semilla de buena calidad.</w:t>
-      </w:r>
-    </w:p>
-    <w:p>
-      <w:pPr>
-        <w:pStyle w:val="ListBullet"/>
-      </w:pPr>
-      <w:r>
-        <w:rPr>
-          <w:rFonts w:ascii="Calibri" w:hAnsi="Calibri"/>
-          <w:b w:val="0"/>
-          <w:i w:val="0"/>
-          <w:color w:val="1A2238"/>
-          <w:sz w:val="21"/>
-        </w:rPr>
-        <w:t>Promover la producción de alimento de buena calidad con normas técnicas de alimento balanceado (usando harina de pescado u otros sustitutos de bajo costo) e instalar plantas piloto.</w:t>
-      </w:r>
-    </w:p>
-    <w:p>
-      <w:pPr>
-        <w:pStyle w:val="ListBullet"/>
-      </w:pPr>
-      <w:r>
-        <w:rPr>
-          <w:rFonts w:ascii="Calibri" w:hAnsi="Calibri"/>
-          <w:b w:val="0"/>
-          <w:i w:val="0"/>
-          <w:color w:val="1A2238"/>
-          <w:sz w:val="21"/>
-        </w:rPr>
-        <w:t>Establecer programas de capacitación y extensión sistemática en las Regiones, e implementar protocolos de buenas prácticas acuícolas en granjas demostrativas.</w:t>
-      </w:r>
-    </w:p>
-    <w:p>
-      <w:pPr>
-        <w:pStyle w:val="ListBullet"/>
-      </w:pPr>
-      <w:r>
-        <w:rPr>
-          <w:rFonts w:ascii="Calibri" w:hAnsi="Calibri"/>
-          <w:b w:val="0"/>
-          <w:i w:val="0"/>
-          <w:color w:val="1A2238"/>
-          <w:sz w:val="21"/>
-        </w:rPr>
-        <w:t>Mejorar la formación de profesionales a nivel universitario y de postgrado en acuicultura.</w:t>
-      </w:r>
-    </w:p>
-    <w:p>
-      <w:pPr>
-        <w:pStyle w:val="ListBullet"/>
-      </w:pPr>
-      <w:r>
-        <w:rPr>
-          <w:rFonts w:ascii="Calibri" w:hAnsi="Calibri"/>
-          <w:b w:val="0"/>
-          <w:i w:val="0"/>
-          <w:color w:val="1A2238"/>
-          <w:sz w:val="21"/>
-        </w:rPr>
-        <w:t>Establecer un sistema nacional de sanidad acuícola con centros de referencia equipados y unidades de base para monitoreo, y regular la prestación de servicios de sanidad acuícola.</w:t>
-      </w:r>
-    </w:p>
-    <w:p>
-      <w:pPr>
-        <w:pStyle w:val="ListBullet"/>
-      </w:pPr>
-      <w:r>
-        <w:rPr>
-          <w:rFonts w:ascii="Calibri" w:hAnsi="Calibri"/>
-          <w:b w:val="0"/>
-          <w:i w:val="0"/>
-          <w:color w:val="1A2238"/>
-          <w:sz w:val="21"/>
-        </w:rPr>
-        <w:t>Establecer prioridades de investigación por especies (exóticas con tecnologías conocidas y nativas) articulando instituciones de investigación con empresas, gremios e inversionistas.</w:t>
-      </w:r>
-    </w:p>
-    <w:p>
-      <w:pPr>
-        <w:pStyle w:val="ListBullet"/>
-      </w:pPr>
-      <w:r>
-        <w:rPr>
-          <w:rFonts w:ascii="Calibri" w:hAnsi="Calibri"/>
-          <w:b w:val="0"/>
-          <w:i w:val="0"/>
-          <w:color w:val="1A2238"/>
-          <w:sz w:val="21"/>
-        </w:rPr>
-        <w:t>Desarrollar y adaptar tecnologías para la producción nacional de semilla de buena calidad (nauplios, postlarvas, ovas embrionadas).</w:t>
-      </w:r>
-    </w:p>
-    <w:p>
-      <w:pPr>
-        <w:pStyle w:val="ListBullet"/>
-      </w:pPr>
-      <w:r>
-        <w:rPr>
-          <w:rFonts w:ascii="Calibri" w:hAnsi="Calibri"/>
-          <w:b w:val="0"/>
-          <w:i w:val="0"/>
-          <w:color w:val="1A2238"/>
-          <w:sz w:val="21"/>
-        </w:rPr>
-        <w:t>Fortalecer capacidades organizacionales y de recursos humanos para la ordenación y desarrollo, y el sistema de captación y difusión de información estadística.</w:t>
-      </w:r>
-    </w:p>
-    <w:p>
-      <w:pPr>
-        <w:pStyle w:val="ListBullet"/>
-      </w:pPr>
-      <w:r>
-        <w:rPr>
-          <w:rFonts w:ascii="Calibri" w:hAnsi="Calibri"/>
-          <w:b w:val="0"/>
-          <w:i w:val="0"/>
-          <w:color w:val="1A2238"/>
-          <w:sz w:val="21"/>
-        </w:rPr>
-        <w:t>Analizar, diseñar e implementar instrumentos para el incremento, distribución y óptimo uso de recursos financieros para la acuicultura.</w:t>
-      </w:r>
-    </w:p>
-    <w:p>
-      <w:pPr>
-        <w:pStyle w:val="ListBullet"/>
-      </w:pPr>
-      <w:r>
-        <w:rPr>
-          <w:rFonts w:ascii="Calibri" w:hAnsi="Calibri"/>
-          <w:b w:val="0"/>
-          <w:i w:val="0"/>
-          <w:color w:val="1A2238"/>
-          <w:sz w:val="21"/>
-        </w:rPr>
-        <w:t>Crear el Instituto Nacional de Acuicultura.</w:t>
-      </w:r>
-    </w:p>
-    <w:p>
-      <w:pPr>
-        <w:pStyle w:val="ListBullet"/>
-      </w:pPr>
-      <w:r>
-        <w:rPr>
-          <w:rFonts w:ascii="Calibri" w:hAnsi="Calibri"/>
-          <w:b w:val="0"/>
-          <w:i w:val="0"/>
-          <w:color w:val="1A2238"/>
-          <w:sz w:val="21"/>
-        </w:rPr>
-        <w:t>Reducir sistemáticamente la corrupción y eliminar la injerencia política partidaria en la designación de cargos técnicos.</w:t>
+        <w:t>Aplicación de medidas de producción sostenibles, buenas prácticas, bioseguridad, trazabilidad, principio precautorio y enfoque ecosistémico (EEA).</w:t>
       </w:r>
     </w:p>
     <w:p>
@@ -2165,7 +1809,7 @@
           <w:color w:val="1A2238"/>
           <w:sz w:val="21"/>
         </w:rPr>
-        <w:t>Priorizar primero la Reforma del Estado —para tener un Estado fuerte, eficaz, eficiente y transparente— como condición trascendente para el desarrollo nacional; una vez iniciado ese proceso, promover decididamente la actividad acuícola creando el Instituto Nacional de Acuicultura y ejecutando el Plan Perú 2040 con voluntad política que trascienda los periodos de gobierno, capital humano probo, ciencia, tecnología e innovación, e inversión privada y del Estado, manteniendo el equilibrio entre la pesca extractiva y la acuicultura.</w:t>
+        <w:t>El documento concluye que el Estado debe ser fuerte, eficaz, eficiente y transparente, y que la prioridad es atender primero la Reforma del Estado por ser trascendente para el desarrollo nacional; una vez iniciada la reforma, se promueve la actividad acuícola. Recomienda crear el Instituto Nacional de Acuicultura, simplificar administrativamente autorizaciones y concesiones, reducir sistemáticamente la corrupción, asegurar insumos (semilla y alimento), articular Gobierno Nacional, Gobiernos Regionales/Locales, sector privado, academia y cooperación internacional, y la participación de profesionales multidisciplinarios con mayor inclusión de ingenieros.</w:t>
       </w:r>
     </w:p>
     <w:p/>

</xml_diff>